<commit_message>
feat: currículo otimizado para ATS (feedback Gemini) — estrutura reforçada
Reestrutura o currículo (arquivos fixos PT/EN + dados do site) seguindo boas
práticas de ATS:

- Objetivo passa a citar "Engenharia de Software" (termo da vaga)
- Resumo mais denso, com os termos-chave: banco de dados, aplicações web,
  automação de processos e extração de dados
- Projetos com bullets de conquista (verbos de ação); Realtime API Watcher em 1º
- Remove seções redundantes (Destaques e Soft Skills) dos arquivos
- Competências reorganizadas com grupo "Backend & Banco de Dados" e menção
  honesta de transferência ao C# (base em POO/Java)
- Formação com a instituição (Estácio) e foco em Engenharia de Software

Co-Authored-By: Claude Opus 4.8 (1M context) <noreply@anthropic.com>
</commit_message>
<xml_diff>
--- a/public/cv/Curriculo-Henrique-Lima.docx
+++ b/public/cv/Curriculo-Henrique-Lima.docx
@@ -18,16 +18,16 @@
     </w:p>
     <w:p>
       <w:pPr>
-        <w:spacing w:before="0" w:after="0"/>
+        <w:spacing w:before="0" w:after="20"/>
       </w:pPr>
       <w:r>
         <w:rPr>
           <w:rFonts w:ascii="Arial" w:hAnsi="Arial"/>
           <w:b w:val="0"/>
           <w:color w:val="000000"/>
-          <w:sz w:val="24"/>
+          <w:sz w:val="22"/>
         </w:rPr>
-        <w:t>Análise e Desenvolvimento de Sistemas</w:t>
+        <w:t>Objetivo: Estágio em Desenvolvimento de Software / Engenharia de Software</w:t>
       </w:r>
     </w:p>
     <w:p>
@@ -39,14 +39,14 @@
           <w:rFonts w:ascii="Arial" w:hAnsi="Arial"/>
           <w:b w:val="0"/>
           <w:color w:val="000000"/>
-          <w:sz w:val="20"/>
+          <w:sz w:val="18"/>
         </w:rPr>
-        <w:t>Objetivo: Estágio em Desenvolvimento de Software</w:t>
+        <w:t>Paulista, PE   |   +55 (81) 98367-3405   |   henriquebl2000@gmail.com</w:t>
       </w:r>
     </w:p>
     <w:p>
       <w:pPr>
-        <w:spacing w:before="0" w:after="80"/>
+        <w:spacing w:before="0" w:after="0"/>
       </w:pPr>
       <w:r>
         <w:rPr>
@@ -55,12 +55,12 @@
           <w:color w:val="000000"/>
           <w:sz w:val="18"/>
         </w:rPr>
-        <w:t>Paulista, PE  |  +55 (81) 98367-3405  |  henriquebl2000@gmail.com  |  github.com/HenriqueBL  |  linkedin.com/in/henriquebdl</w:t>
+        <w:t>linkedin.com/in/henriquebdl   |   github.com/HenriqueBL</w:t>
       </w:r>
     </w:p>
     <w:p>
       <w:pPr>
-        <w:spacing w:before="160" w:after="60"/>
+        <w:spacing w:before="180" w:after="60"/>
         <w:pBdr>
           <w:bottom w:val="single" w:sz="6" w:space="2" w:color="B4B4B4"/>
         </w:pBdr>
@@ -86,104 +86,12 @@
           <w:color w:val="000000"/>
           <w:sz w:val="21"/>
         </w:rPr>
-        <w:t>Estudante de Análise e Desenvolvimento de Sistemas (4º período) em busca de estágio em desenvolvimento de software. Trabalho com Java e Python — incluindo automação de processos e extração de dados com Selenium, Playwright e requests — além de aplicações web com React, integração via APIs REST e banco de dados SQL. Uso desenvolvimento assistido por IA para entregar com qualidade e velocidade. Inglês fluente, com semestre de High School nos Estados Unidos; perfil autodidata, proativo e movido por curiosidade.</w:t>
+        <w:t>Estudante de Análise e Desenvolvimento de Sistemas (4º período), proativo e movido por tecnologia. Tenho experiência prática no desenvolvimento de aplicações web, bancos de dados SQL e integração via APIs REST com Java e Python, além de automação de processos e extração de dados (web scraping) com Selenium, Playwright e requests. Base sólida em lógica de programação e POO, com foco em entregar código de qualidade usando desenvolvimento assistido por IA (Claude Code). Inglês fluente (intercâmbio nos EUA), aprendizado rápido e comunicação clara.</w:t>
       </w:r>
     </w:p>
     <w:p>
       <w:pPr>
-        <w:spacing w:before="160" w:after="60"/>
-        <w:pBdr>
-          <w:bottom w:val="single" w:sz="6" w:space="2" w:color="B4B4B4"/>
-        </w:pBdr>
-      </w:pPr>
-      <w:r>
-        <w:rPr>
-          <w:rFonts w:ascii="Arial" w:hAnsi="Arial"/>
-          <w:b/>
-          <w:color w:val="000000"/>
-          <w:sz w:val="24"/>
-        </w:rPr>
-        <w:t>DESTAQUES</w:t>
-      </w:r>
-    </w:p>
-    <w:p>
-      <w:pPr>
-        <w:pStyle w:val="ListBullet"/>
-        <w:spacing w:after="20"/>
-      </w:pPr>
-      <w:r>
-        <w:rPr>
-          <w:rFonts w:ascii="Arial" w:hAnsi="Arial"/>
-          <w:b w:val="0"/>
-          <w:color w:val="000000"/>
-          <w:sz w:val="21"/>
-        </w:rPr>
-        <w:t>Automação de processos e extração de dados com Python (Selenium, Playwright, requests)</w:t>
-      </w:r>
-    </w:p>
-    <w:p>
-      <w:pPr>
-        <w:pStyle w:val="ListBullet"/>
-        <w:spacing w:after="20"/>
-      </w:pPr>
-      <w:r>
-        <w:rPr>
-          <w:rFonts w:ascii="Arial" w:hAnsi="Arial"/>
-          <w:b w:val="0"/>
-          <w:color w:val="000000"/>
-          <w:sz w:val="21"/>
-        </w:rPr>
-        <w:t>Aplicações web e APIs REST com Java, Spring Boot e React</w:t>
-      </w:r>
-    </w:p>
-    <w:p>
-      <w:pPr>
-        <w:pStyle w:val="ListBullet"/>
-        <w:spacing w:after="20"/>
-      </w:pPr>
-      <w:r>
-        <w:rPr>
-          <w:rFonts w:ascii="Arial" w:hAnsi="Arial"/>
-          <w:b w:val="0"/>
-          <w:color w:val="000000"/>
-          <w:sz w:val="21"/>
-        </w:rPr>
-        <w:t>Banco de dados SQL e testes automatizados (JUnit)</w:t>
-      </w:r>
-    </w:p>
-    <w:p>
-      <w:pPr>
-        <w:pStyle w:val="ListBullet"/>
-        <w:spacing w:after="20"/>
-      </w:pPr>
-      <w:r>
-        <w:rPr>
-          <w:rFonts w:ascii="Arial" w:hAnsi="Arial"/>
-          <w:b w:val="0"/>
-          <w:color w:val="000000"/>
-          <w:sz w:val="21"/>
-        </w:rPr>
-        <w:t>Colaboração produtiva com IA (Claude Code, Prompt Engineering)</w:t>
-      </w:r>
-    </w:p>
-    <w:p>
-      <w:pPr>
-        <w:pStyle w:val="ListBullet"/>
-        <w:spacing w:after="20"/>
-      </w:pPr>
-      <w:r>
-        <w:rPr>
-          <w:rFonts w:ascii="Arial" w:hAnsi="Arial"/>
-          <w:b w:val="0"/>
-          <w:color w:val="000000"/>
-          <w:sz w:val="21"/>
-        </w:rPr>
-        <w:t>Inglês fluente, perfil proativo e aprendizado rápido</w:t>
-      </w:r>
-    </w:p>
-    <w:p>
-      <w:pPr>
-        <w:spacing w:before="160" w:after="60"/>
+        <w:spacing w:before="180" w:after="60"/>
         <w:pBdr>
           <w:bottom w:val="single" w:sz="6" w:space="2" w:color="B4B4B4"/>
         </w:pBdr>
@@ -209,7 +117,7 @@
           <w:color w:val="000000"/>
           <w:sz w:val="21"/>
         </w:rPr>
-        <w:t>Análise e Desenvolvimento de Sistemas</w:t>
+        <w:t>Análise e Desenvolvimento de Sistemas — Estácio</w:t>
       </w:r>
       <w:r>
         <w:rPr>
@@ -232,7 +140,7 @@
           <w:color w:val="000000"/>
           <w:sz w:val="19"/>
         </w:rPr>
-        <w:t>Graduação em andamento</w:t>
+        <w:t>Graduação em andamento (4º período)</w:t>
       </w:r>
     </w:p>
     <w:p>
@@ -246,7 +154,7 @@
           <w:color w:val="000000"/>
           <w:sz w:val="21"/>
         </w:rPr>
-        <w:t>4º período. Foco em programação, POO, banco de dados e desenvolvimento web.</w:t>
+        <w:t>Foco: Estrutura de Dados, Programação Orientada a Objetos (POO), Banco de Dados SQL e Engenharia de Software.</w:t>
       </w:r>
     </w:p>
     <w:p>
@@ -302,7 +210,7 @@
     </w:p>
     <w:p>
       <w:pPr>
-        <w:spacing w:before="160" w:after="60"/>
+        <w:spacing w:before="180" w:after="60"/>
         <w:pBdr>
           <w:bottom w:val="single" w:sz="6" w:space="2" w:color="B4B4B4"/>
         </w:pBdr>
@@ -328,12 +236,70 @@
           <w:color w:val="000000"/>
           <w:sz w:val="21"/>
         </w:rPr>
+        <w:t>Realtime API Watcher</w:t>
+      </w:r>
+    </w:p>
+    <w:p>
+      <w:pPr>
+        <w:spacing w:before="0" w:after="20"/>
+      </w:pPr>
+      <w:r>
+        <w:rPr>
+          <w:rFonts w:ascii="Arial" w:hAnsi="Arial"/>
+          <w:b w:val="0"/>
+          <w:color w:val="000000"/>
+          <w:sz w:val="19"/>
+        </w:rPr>
+        <w:t>Python, Requests, Threading, APIs REST</w:t>
+      </w:r>
+    </w:p>
+    <w:p>
+      <w:pPr>
+        <w:pStyle w:val="ListBullet"/>
+        <w:spacing w:after="20"/>
+      </w:pPr>
+      <w:r>
+        <w:rPr>
+          <w:rFonts w:ascii="Arial" w:hAnsi="Arial"/>
+          <w:b w:val="0"/>
+          <w:color w:val="000000"/>
+          <w:sz w:val="21"/>
+        </w:rPr>
+        <w:t>Monitor de API em tempo real para automação de processos e extração de dados, com polling de baixa latência.</w:t>
+      </w:r>
+    </w:p>
+    <w:p>
+      <w:pPr>
+        <w:pStyle w:val="ListBullet"/>
+        <w:spacing w:after="20"/>
+      </w:pPr>
+      <w:r>
+        <w:rPr>
+          <w:rFonts w:ascii="Arial" w:hAnsi="Arial"/>
+          <w:b w:val="0"/>
+          <w:color w:val="000000"/>
+          <w:sz w:val="21"/>
+        </w:rPr>
+        <w:t>Arquitetura com controle de concorrência (threads), autenticação JWT e resiliência com retry e backoff exponencial.</w:t>
+      </w:r>
+    </w:p>
+    <w:p>
+      <w:pPr>
+        <w:spacing w:before="40" w:after="0"/>
+      </w:pPr>
+      <w:r>
+        <w:rPr>
+          <w:rFonts w:ascii="Arial" w:hAnsi="Arial"/>
+          <w:b/>
+          <w:color w:val="000000"/>
+          <w:sz w:val="21"/>
+        </w:rPr>
         <w:t>Todo API — Gerenciador de Tarefas</w:t>
       </w:r>
     </w:p>
     <w:p>
       <w:pPr>
-        <w:spacing w:before="0" w:after="0"/>
+        <w:spacing w:before="0" w:after="20"/>
       </w:pPr>
       <w:r>
         <w:rPr>
@@ -347,7 +313,8 @@
     </w:p>
     <w:p>
       <w:pPr>
-        <w:spacing w:before="0" w:after="60"/>
+        <w:pStyle w:val="ListBullet"/>
+        <w:spacing w:after="20"/>
       </w:pPr>
       <w:r>
         <w:rPr>
@@ -356,40 +323,13 @@
           <w:color w:val="000000"/>
           <w:sz w:val="21"/>
         </w:rPr>
-        <w:t>API REST com CRUD, validação, tratamento global de erros e testes.</w:t>
+        <w:t>API REST completa com operações de CRUD, validação de dados e tratamento global de erros.</w:t>
       </w:r>
     </w:p>
     <w:p>
       <w:pPr>
-        <w:spacing w:before="40" w:after="0"/>
-      </w:pPr>
-      <w:r>
-        <w:rPr>
-          <w:rFonts w:ascii="Arial" w:hAnsi="Arial"/>
-          <w:b/>
-          <w:color w:val="000000"/>
-          <w:sz w:val="21"/>
-        </w:rPr>
-        <w:t>Realtime API Watcher</w:t>
-      </w:r>
-    </w:p>
-    <w:p>
-      <w:pPr>
-        <w:spacing w:before="0" w:after="0"/>
-      </w:pPr>
-      <w:r>
-        <w:rPr>
-          <w:rFonts w:ascii="Arial" w:hAnsi="Arial"/>
-          <w:b w:val="0"/>
-          <w:color w:val="000000"/>
-          <w:sz w:val="19"/>
-        </w:rPr>
-        <w:t>Python, requests, Threading, APIs REST</w:t>
-      </w:r>
-    </w:p>
-    <w:p>
-      <w:pPr>
-        <w:spacing w:before="0" w:after="60"/>
+        <w:pStyle w:val="ListBullet"/>
+        <w:spacing w:after="20"/>
       </w:pPr>
       <w:r>
         <w:rPr>
@@ -398,7 +338,7 @@
           <w:color w:val="000000"/>
           <w:sz w:val="21"/>
         </w:rPr>
-        <w:t>Monitor de API em tempo real que dispara ações automáticas; JWT, concorrência e backoff.</w:t>
+        <w:t>Testes automatizados com JUnit para garantir a qualidade das funcionalidades da aplicação.</w:t>
       </w:r>
     </w:p>
     <w:p>
@@ -417,7 +357,7 @@
     </w:p>
     <w:p>
       <w:pPr>
-        <w:spacing w:before="0" w:after="0"/>
+        <w:spacing w:before="0" w:after="20"/>
       </w:pPr>
       <w:r>
         <w:rPr>
@@ -431,7 +371,8 @@
     </w:p>
     <w:p>
       <w:pPr>
-        <w:spacing w:before="0" w:after="60"/>
+        <w:pStyle w:val="ListBullet"/>
+        <w:spacing w:after="20"/>
       </w:pPr>
       <w:r>
         <w:rPr>
@@ -440,12 +381,12 @@
           <w:color w:val="000000"/>
           <w:sz w:val="21"/>
         </w:rPr>
-        <w:t>Site com SSG, dark mode, currículo bilíngue e SEO completo.</w:t>
+        <w:t>Aplicação web responsiva com foco em performance (SSG), otimização de SEO e interface limpa (UI/UX).</w:t>
       </w:r>
     </w:p>
     <w:p>
       <w:pPr>
-        <w:spacing w:before="160" w:after="60"/>
+        <w:spacing w:before="180" w:after="60"/>
         <w:pBdr>
           <w:bottom w:val="single" w:sz="6" w:space="2" w:color="B4B4B4"/>
         </w:pBdr>
@@ -480,7 +421,7 @@
           <w:color w:val="000000"/>
           <w:sz w:val="21"/>
         </w:rPr>
-        <w:t>Java, Python, TypeScript, JavaScript, HTML, CSS, SQL</w:t>
+        <w:t>Python, Java, JavaScript, TypeScript, SQL, HTML, CSS  (base em POO/Java transferível para C#)</w:t>
       </w:r>
     </w:p>
     <w:p>
@@ -503,7 +444,30 @@
           <w:color w:val="000000"/>
           <w:sz w:val="21"/>
         </w:rPr>
-        <w:t>Selenium, Playwright, PyAutoGUI, Requests, Web Scraping, Automação de Processos</w:t>
+        <w:t>Web Scraping, Selenium, Playwright, PyAutoGUI, Requests, Automação de Processos</w:t>
+      </w:r>
+    </w:p>
+    <w:p>
+      <w:pPr>
+        <w:spacing w:before="0" w:after="20"/>
+      </w:pPr>
+      <w:r>
+        <w:rPr>
+          <w:rFonts w:ascii="Arial" w:hAnsi="Arial"/>
+          <w:b/>
+          <w:color w:val="000000"/>
+          <w:sz w:val="21"/>
+        </w:rPr>
+        <w:t xml:space="preserve">Backend &amp; Banco de Dados: </w:t>
+      </w:r>
+      <w:r>
+        <w:rPr>
+          <w:rFonts w:ascii="Arial" w:hAnsi="Arial"/>
+          <w:b w:val="0"/>
+          <w:color w:val="000000"/>
+          <w:sz w:val="21"/>
+        </w:rPr>
+        <w:t>APIs REST, Spring Boot, Banco de Dados SQL, JUnit</w:t>
       </w:r>
     </w:p>
     <w:p>
@@ -526,7 +490,7 @@
           <w:color w:val="000000"/>
           <w:sz w:val="21"/>
         </w:rPr>
-        <w:t>React, Next.js, Tailwind CSS, Responsividade, UI/UX</w:t>
+        <w:t>React, Next.js, Tailwind CSS, Desenvolvimento Web Responsivo</w:t>
       </w:r>
     </w:p>
     <w:p>
@@ -540,7 +504,7 @@
           <w:color w:val="000000"/>
           <w:sz w:val="21"/>
         </w:rPr>
-        <w:t xml:space="preserve">IA &amp; Produtividade: </w:t>
+        <w:t xml:space="preserve">Ferramentas &amp; Produtividade: </w:t>
       </w:r>
       <w:r>
         <w:rPr>
@@ -549,58 +513,12 @@
           <w:color w:val="000000"/>
           <w:sz w:val="21"/>
         </w:rPr>
-        <w:t>Claude Code, AI-Assisted Development, Prompt Engineering</w:t>
+        <w:t>Git, GitHub, VS Code, Claude Code, AI-Assisted Development, Prompt Engineering</w:t>
       </w:r>
     </w:p>
     <w:p>
       <w:pPr>
-        <w:spacing w:before="0" w:after="20"/>
-      </w:pPr>
-      <w:r>
-        <w:rPr>
-          <w:rFonts w:ascii="Arial" w:hAnsi="Arial"/>
-          <w:b/>
-          <w:color w:val="000000"/>
-          <w:sz w:val="21"/>
-        </w:rPr>
-        <w:t xml:space="preserve">Ferramentas: </w:t>
-      </w:r>
-      <w:r>
-        <w:rPr>
-          <w:rFonts w:ascii="Arial" w:hAnsi="Arial"/>
-          <w:b w:val="0"/>
-          <w:color w:val="000000"/>
-          <w:sz w:val="21"/>
-        </w:rPr>
-        <w:t>Git, GitHub, APIs REST, VS Code</w:t>
-      </w:r>
-    </w:p>
-    <w:p>
-      <w:pPr>
-        <w:spacing w:before="0" w:after="20"/>
-      </w:pPr>
-      <w:r>
-        <w:rPr>
-          <w:rFonts w:ascii="Arial" w:hAnsi="Arial"/>
-          <w:b/>
-          <w:color w:val="000000"/>
-          <w:sz w:val="21"/>
-        </w:rPr>
-        <w:t xml:space="preserve">Fundamentos: </w:t>
-      </w:r>
-      <w:r>
-        <w:rPr>
-          <w:rFonts w:ascii="Arial" w:hAnsi="Arial"/>
-          <w:b w:val="0"/>
-          <w:color w:val="000000"/>
-          <w:sz w:val="21"/>
-        </w:rPr>
-        <w:t>Lógica de Programação, POO, Banco de Dados</w:t>
-      </w:r>
-    </w:p>
-    <w:p>
-      <w:pPr>
-        <w:spacing w:before="160" w:after="60"/>
+        <w:spacing w:before="180" w:after="60"/>
         <w:pBdr>
           <w:bottom w:val="single" w:sz="6" w:space="2" w:color="B4B4B4"/>
         </w:pBdr>
@@ -612,12 +530,12 @@
           <w:color w:val="000000"/>
           <w:sz w:val="24"/>
         </w:rPr>
-        <w:t>IDIOMAS</w:t>
+        <w:t>IDIOMAS E CURSOS</w:t>
       </w:r>
     </w:p>
     <w:p>
       <w:pPr>
-        <w:spacing w:before="0" w:after="80"/>
+        <w:spacing w:before="0" w:after="40"/>
       </w:pPr>
       <w:r>
         <w:rPr>
@@ -626,43 +544,12 @@
           <w:color w:val="000000"/>
           <w:sz w:val="21"/>
         </w:rPr>
-        <w:t>Português (Nativo)   ·   Inglês (Fluente)</w:t>
+        <w:t>Inglês: Fluente      ·      Português: Nativo</w:t>
       </w:r>
     </w:p>
     <w:p>
       <w:pPr>
-        <w:spacing w:before="160" w:after="60"/>
-        <w:pBdr>
-          <w:bottom w:val="single" w:sz="6" w:space="2" w:color="B4B4B4"/>
-        </w:pBdr>
-      </w:pPr>
-      <w:r>
-        <w:rPr>
-          <w:rFonts w:ascii="Arial" w:hAnsi="Arial"/>
-          <w:b/>
-          <w:color w:val="000000"/>
-          <w:sz w:val="24"/>
-        </w:rPr>
-        <w:t>CURSOS</w:t>
-      </w:r>
-    </w:p>
-    <w:p>
-      <w:pPr>
-        <w:spacing w:before="40" w:after="0"/>
-      </w:pPr>
-      <w:r>
-        <w:rPr>
-          <w:rFonts w:ascii="Arial" w:hAnsi="Arial"/>
-          <w:b/>
-          <w:color w:val="000000"/>
-          <w:sz w:val="21"/>
-        </w:rPr>
-        <w:t>Curso de Java · Udemy</w:t>
-      </w:r>
-    </w:p>
-    <w:p>
-      <w:pPr>
-        <w:spacing w:before="0" w:after="60"/>
+        <w:spacing w:before="0" w:after="40"/>
       </w:pPr>
       <w:r>
         <w:rPr>
@@ -671,38 +558,7 @@
           <w:color w:val="000000"/>
           <w:sz w:val="21"/>
         </w:rPr>
-        <w:t>Fundamentos da linguagem, orientação a objetos e lógica de programação.</w:t>
-      </w:r>
-    </w:p>
-    <w:p>
-      <w:pPr>
-        <w:spacing w:before="160" w:after="60"/>
-        <w:pBdr>
-          <w:bottom w:val="single" w:sz="6" w:space="2" w:color="B4B4B4"/>
-        </w:pBdr>
-      </w:pPr>
-      <w:r>
-        <w:rPr>
-          <w:rFonts w:ascii="Arial" w:hAnsi="Arial"/>
-          <w:b/>
-          <w:color w:val="000000"/>
-          <w:sz w:val="24"/>
-        </w:rPr>
-        <w:t>COMPETÊNCIAS COMPORTAMENTAIS</w:t>
-      </w:r>
-    </w:p>
-    <w:p>
-      <w:pPr>
-        <w:spacing w:before="0" w:after="80"/>
-      </w:pPr>
-      <w:r>
-        <w:rPr>
-          <w:rFonts w:ascii="Arial" w:hAnsi="Arial"/>
-          <w:b w:val="0"/>
-          <w:color w:val="000000"/>
-          <w:sz w:val="21"/>
-        </w:rPr>
-        <w:t>Comunicação, Organização, Aprendizado rápido, Trabalho em equipe, Resolução de problemas, Pensamento analítico, Curiosidade, Adaptabilidade.</w:t>
+        <w:t>Curso de Java — Udemy: fundamentos da linguagem, orientação a objetos e lógica de programação.</w:t>
       </w:r>
     </w:p>
     <w:sectPr>

</xml_diff>

<commit_message>
feat: adiciona datas de conclusão no currículo (site + arquivos PT/EN)
Preenche datas que faltavam (apontadas no Solides):
- ADS (Estácio): conclusão prevista Jun/2027 (início Jan/2025)
- High School (Mt Ida, Arkansas): 2018
- Curso de Java: 54h, concluído em Fev/2026

Co-Authored-By: Claude Opus 4.8 (1M context) <noreply@anthropic.com>
</commit_message>
<xml_diff>
--- a/public/cv/Curriculo-Henrique-Lima.docx
+++ b/public/cv/Curriculo-Henrique-Lima.docx
@@ -126,7 +126,7 @@
           <w:color w:val="000000"/>
           <w:sz w:val="19"/>
         </w:rPr>
-        <w:t xml:space="preserve">    Jan 2025 – Atual</w:t>
+        <w:t xml:space="preserve">    Jan 2025 – Jun 2027 (previsto)</w:t>
       </w:r>
     </w:p>
     <w:p>
@@ -177,7 +177,7 @@
           <w:color w:val="000000"/>
           <w:sz w:val="19"/>
         </w:rPr>
-        <w:t xml:space="preserve">    1 semestre</w:t>
+        <w:t xml:space="preserve">    2018 · 1 semestre</w:t>
       </w:r>
     </w:p>
     <w:p>
@@ -558,7 +558,7 @@
           <w:color w:val="000000"/>
           <w:sz w:val="21"/>
         </w:rPr>
-        <w:t>Curso de Java — Udemy: fundamentos da linguagem, orientação a objetos e lógica de programação.</w:t>
+        <w:t>Curso de Java (54h) — Udemy (concluído em Fev/2026): fundamentos da linguagem, orientação a objetos e lógica de programação.</w:t>
       </w:r>
     </w:p>
     <w:sectPr>

</xml_diff>